<commit_message>
Use dated contract references, alphanumeric identity cards and seasonal passport deadlines
</commit_message>
<xml_diff>
--- a/templates/apply/documents/annex_2027.docx
+++ b/templates/apply/documents/annex_2027.docx
@@ -115,7 +115,7 @@
           <w:szCs w:val="18"/>
           <w:lang w:val="bg-BG"/>
         </w:rPr>
-        <w:t xml:space="preserve">към Договор № {{ contract_number }} от</w:t>
+        <w:t>към Договор от</w:t>
       </w:r>
       <w:r>
         <w:rPr>
@@ -195,7 +195,6 @@
           <w:szCs w:val="18"/>
           <w:lang w:val="bg-BG"/>
         </w:rPr>
-        <w:t xml:space="preserve"> </w:t>
       </w:r>
       <w:r>
         <w:rPr>
@@ -655,7 +654,7 @@
           <w:szCs w:val="18"/>
           <w:lang w:val="bg-BG"/>
         </w:rPr>
-        <w:t xml:space="preserve">се подписа настоящия Анекс №1 („Анекс“) към Договор № {{ contract_number }} от </w:t>
+        <w:t>се подписа настоящия Анекс №1 („Анекс“) към Договор от</w:t>
       </w:r>
       <w:r>
         <w:rPr>

</xml_diff>

<commit_message>
Use dated contracts and seasonal passport validity (#20)
Accept Latin/Cyrillic identity card letters; use registration date in EUR contract and annex references, email, confirmation and Sheets. Calculate passport validity six months after 30 October for each season.
</commit_message>
<xml_diff>
--- a/templates/apply/documents/annex_2027.docx
+++ b/templates/apply/documents/annex_2027.docx
@@ -115,7 +115,7 @@
           <w:szCs w:val="18"/>
           <w:lang w:val="bg-BG"/>
         </w:rPr>
-        <w:t xml:space="preserve">към Договор № {{ contract_number }} от</w:t>
+        <w:t>към Договор от</w:t>
       </w:r>
       <w:r>
         <w:rPr>
@@ -195,7 +195,6 @@
           <w:szCs w:val="18"/>
           <w:lang w:val="bg-BG"/>
         </w:rPr>
-        <w:t xml:space="preserve"> </w:t>
       </w:r>
       <w:r>
         <w:rPr>
@@ -655,7 +654,7 @@
           <w:szCs w:val="18"/>
           <w:lang w:val="bg-BG"/>
         </w:rPr>
-        <w:t xml:space="preserve">се подписа настоящия Анекс №1 („Анекс“) към Договор № {{ contract_number }} от </w:t>
+        <w:t>се подписа настоящия Анекс №1 („Анекс“) към Договор от</w:t>
       </w:r>
       <w:r>
         <w:rPr>

</xml_diff>